<commit_message>
Fix final B report wording and refresh packages
</commit_message>
<xml_diff>
--- a/PROJECT/BISM2202_OUTPUT/Version_B/BISM2202_Report_B.docx
+++ b/PROJECT/BISM2202_OUTPUT/Version_B/BISM2202_Report_B.docx
@@ -1940,7 +1940,7 @@
         <w:spacing w:after="160"/>
       </w:pPr>
       <w:r>
-        <w:t>The 100% bars compare composition rather than payment-method size. Card is 44.57% High traffic; Cash and UPI are mainly Medium traffic at 48.02% and 47.60%; Wallet is mainly Low traffic at 44.71%. Small groups such as Hut Points (24 orders) and Domino's Cash (23) require cautious percentage comparisons.</w:t>
+        <w:t>The percentage matrix compares composition within each payment method. Card is 44.57% High traffic; Cash and UPI are mainly Medium traffic at 48.02% and 47.60%; Wallet is mainly Low traffic at 44.71%. Small groups such as Hut Points (24 orders) and Domino's Cash (23) require cautious percentage comparisons.</w:t>
       </w:r>
     </w:p>
     <w:p>
@@ -2038,7 +2038,7 @@
         <w:spacing w:after="160"/>
       </w:pPr>
       <w:r>
-        <w:t>The dashboard begins with demand location, then compares pizza-type delivery performance, and finishes with traffic composition inside payment methods. Atlanta leads location demand with 78 orders, while Stuffed Crust has the longest pizza-type average delivery duration at 39.52 minutes.</w:t>
+        <w:t>The dashboard combines a conditionally formatted restaurant table, an average-delay column chart by Traffic Level, and an hourly order-volume line chart. The table highlights relative restaurant performance, the traffic chart compares delivery conditions, and the line chart shows when order demand is concentrated.</w:t>
       </w:r>
     </w:p>
     <w:p>
@@ -2047,7 +2047,7 @@
         <w:spacing w:after="160"/>
       </w:pPr>
       <w:r>
-        <w:t>The traffic-payment view adds operating context: Card is weighted toward High traffic, while Cash and UPI are weighted toward Medium traffic and Wallet toward Low traffic. Using the Order Time slicer lets the viewer test whether these patterns remain stable across different periods. Together, the three visuals connect where demand occurs, which pizza types take longer, and the conditions surrounding each payment mix.</w:t>
+        <w:t>Papa John's has the shortest average delivery duration at 28.19 minutes, while Marco's Pizza has the highest average delay at 18.44 minutes. High traffic has the highest average delay at 19.16 minutes, and order volume peaks at 19:00 with 328 orders. Read together, the three visuals connect restaurant performance, traffic conditions, and time-of-day demand while keeping the interpretation descriptive rather than causal.</w:t>
       </w:r>
     </w:p>
     <w:sectPr>

</xml_diff>

<commit_message>
finalize BISM2202 A and B submissions
</commit_message>
<xml_diff>
--- a/PROJECT/BISM2202_OUTPUT/Version_B/BISM2202_Report_B.docx
+++ b/PROJECT/BISM2202_OUTPUT/Version_B/BISM2202_Report_B.docx
@@ -113,7 +113,7 @@
       <w:r>
         <w:drawing>
           <wp:inline xmlns:a="http://schemas.openxmlformats.org/drawingml/2006/main" xmlns:pic="http://schemas.openxmlformats.org/drawingml/2006/picture">
-            <wp:extent cx="5989320" cy="3046615"/>
+            <wp:extent cx="5989320" cy="3496016"/>
             <wp:docPr id="1" name="Picture 1"/>
             <wp:cNvGraphicFramePr>
               <a:graphicFrameLocks noChangeAspect="1"/>
@@ -134,7 +134,7 @@
                   <pic:spPr>
                     <a:xfrm>
                       <a:off x="0" y="0"/>
-                      <a:ext cx="5989320" cy="3046615"/>
+                      <a:ext cx="5989320" cy="3496016"/>
                     </a:xfrm>
                     <a:prstGeom prst="rect"/>
                   </pic:spPr>
@@ -211,7 +211,7 @@
       <w:r>
         <w:drawing>
           <wp:inline xmlns:a="http://schemas.openxmlformats.org/drawingml/2006/main" xmlns:pic="http://schemas.openxmlformats.org/drawingml/2006/picture">
-            <wp:extent cx="5989320" cy="3046615"/>
+            <wp:extent cx="5989320" cy="3496016"/>
             <wp:docPr id="2" name="Picture 2"/>
             <wp:cNvGraphicFramePr>
               <a:graphicFrameLocks noChangeAspect="1"/>
@@ -232,7 +232,7 @@
                   <pic:spPr>
                     <a:xfrm>
                       <a:off x="0" y="0"/>
-                      <a:ext cx="5989320" cy="3046615"/>
+                      <a:ext cx="5989320" cy="3496016"/>
                     </a:xfrm>
                     <a:prstGeom prst="rect"/>
                   </pic:spPr>
@@ -309,7 +309,7 @@
       <w:r>
         <w:drawing>
           <wp:inline xmlns:a="http://schemas.openxmlformats.org/drawingml/2006/main" xmlns:pic="http://schemas.openxmlformats.org/drawingml/2006/picture">
-            <wp:extent cx="5989320" cy="3046615"/>
+            <wp:extent cx="5989320" cy="3496016"/>
             <wp:docPr id="3" name="Picture 3"/>
             <wp:cNvGraphicFramePr>
               <a:graphicFrameLocks noChangeAspect="1"/>
@@ -330,7 +330,7 @@
                   <pic:spPr>
                     <a:xfrm>
                       <a:off x="0" y="0"/>
-                      <a:ext cx="5989320" cy="3046615"/>
+                      <a:ext cx="5989320" cy="3496016"/>
                     </a:xfrm>
                     <a:prstGeom prst="rect"/>
                   </pic:spPr>
@@ -407,7 +407,7 @@
       <w:r>
         <w:drawing>
           <wp:inline xmlns:a="http://schemas.openxmlformats.org/drawingml/2006/main" xmlns:pic="http://schemas.openxmlformats.org/drawingml/2006/picture">
-            <wp:extent cx="5989320" cy="3046615"/>
+            <wp:extent cx="5989320" cy="3496016"/>
             <wp:docPr id="4" name="Picture 4"/>
             <wp:cNvGraphicFramePr>
               <a:graphicFrameLocks noChangeAspect="1"/>
@@ -428,7 +428,7 @@
                   <pic:spPr>
                     <a:xfrm>
                       <a:off x="0" y="0"/>
-                      <a:ext cx="5989320" cy="3046615"/>
+                      <a:ext cx="5989320" cy="3496016"/>
                     </a:xfrm>
                     <a:prstGeom prst="rect"/>
                   </pic:spPr>
@@ -505,7 +505,7 @@
       <w:r>
         <w:drawing>
           <wp:inline xmlns:a="http://schemas.openxmlformats.org/drawingml/2006/main" xmlns:pic="http://schemas.openxmlformats.org/drawingml/2006/picture">
-            <wp:extent cx="5989320" cy="3046615"/>
+            <wp:extent cx="5989320" cy="3496016"/>
             <wp:docPr id="5" name="Picture 5"/>
             <wp:cNvGraphicFramePr>
               <a:graphicFrameLocks noChangeAspect="1"/>
@@ -526,7 +526,7 @@
                   <pic:spPr>
                     <a:xfrm>
                       <a:off x="0" y="0"/>
-                      <a:ext cx="5989320" cy="3046615"/>
+                      <a:ext cx="5989320" cy="3496016"/>
                     </a:xfrm>
                     <a:prstGeom prst="rect"/>
                   </pic:spPr>
@@ -603,7 +603,7 @@
       <w:r>
         <w:drawing>
           <wp:inline xmlns:a="http://schemas.openxmlformats.org/drawingml/2006/main" xmlns:pic="http://schemas.openxmlformats.org/drawingml/2006/picture">
-            <wp:extent cx="5989320" cy="3046615"/>
+            <wp:extent cx="5989320" cy="3496016"/>
             <wp:docPr id="6" name="Picture 6"/>
             <wp:cNvGraphicFramePr>
               <a:graphicFrameLocks noChangeAspect="1"/>
@@ -624,7 +624,7 @@
                   <pic:spPr>
                     <a:xfrm>
                       <a:off x="0" y="0"/>
-                      <a:ext cx="5989320" cy="3046615"/>
+                      <a:ext cx="5989320" cy="3496016"/>
                     </a:xfrm>
                     <a:prstGeom prst="rect"/>
                   </pic:spPr>
@@ -701,7 +701,7 @@
       <w:r>
         <w:drawing>
           <wp:inline xmlns:a="http://schemas.openxmlformats.org/drawingml/2006/main" xmlns:pic="http://schemas.openxmlformats.org/drawingml/2006/picture">
-            <wp:extent cx="5989320" cy="3046615"/>
+            <wp:extent cx="5989320" cy="3496016"/>
             <wp:docPr id="7" name="Picture 7"/>
             <wp:cNvGraphicFramePr>
               <a:graphicFrameLocks noChangeAspect="1"/>
@@ -722,7 +722,7 @@
                   <pic:spPr>
                     <a:xfrm>
                       <a:off x="0" y="0"/>
-                      <a:ext cx="5989320" cy="3046615"/>
+                      <a:ext cx="5989320" cy="3496016"/>
                     </a:xfrm>
                     <a:prstGeom prst="rect"/>
                   </pic:spPr>
@@ -799,7 +799,7 @@
       <w:r>
         <w:drawing>
           <wp:inline xmlns:a="http://schemas.openxmlformats.org/drawingml/2006/main" xmlns:pic="http://schemas.openxmlformats.org/drawingml/2006/picture">
-            <wp:extent cx="5989320" cy="3046615"/>
+            <wp:extent cx="5989320" cy="3496016"/>
             <wp:docPr id="8" name="Picture 8"/>
             <wp:cNvGraphicFramePr>
               <a:graphicFrameLocks noChangeAspect="1"/>
@@ -820,7 +820,7 @@
                   <pic:spPr>
                     <a:xfrm>
                       <a:off x="0" y="0"/>
-                      <a:ext cx="5989320" cy="3046615"/>
+                      <a:ext cx="5989320" cy="3496016"/>
                     </a:xfrm>
                     <a:prstGeom prst="rect"/>
                   </pic:spPr>
@@ -897,7 +897,7 @@
       <w:r>
         <w:drawing>
           <wp:inline xmlns:a="http://schemas.openxmlformats.org/drawingml/2006/main" xmlns:pic="http://schemas.openxmlformats.org/drawingml/2006/picture">
-            <wp:extent cx="5989320" cy="3046615"/>
+            <wp:extent cx="5989320" cy="3496016"/>
             <wp:docPr id="9" name="Picture 9"/>
             <wp:cNvGraphicFramePr>
               <a:graphicFrameLocks noChangeAspect="1"/>
@@ -918,7 +918,7 @@
                   <pic:spPr>
                     <a:xfrm>
                       <a:off x="0" y="0"/>
-                      <a:ext cx="5989320" cy="3046615"/>
+                      <a:ext cx="5989320" cy="3496016"/>
                     </a:xfrm>
                     <a:prstGeom prst="rect"/>
                   </pic:spPr>
@@ -995,7 +995,7 @@
       <w:r>
         <w:drawing>
           <wp:inline xmlns:a="http://schemas.openxmlformats.org/drawingml/2006/main" xmlns:pic="http://schemas.openxmlformats.org/drawingml/2006/picture">
-            <wp:extent cx="5989320" cy="3046615"/>
+            <wp:extent cx="5989320" cy="3496016"/>
             <wp:docPr id="10" name="Picture 10"/>
             <wp:cNvGraphicFramePr>
               <a:graphicFrameLocks noChangeAspect="1"/>
@@ -1016,7 +1016,7 @@
                   <pic:spPr>
                     <a:xfrm>
                       <a:off x="0" y="0"/>
-                      <a:ext cx="5989320" cy="3046615"/>
+                      <a:ext cx="5989320" cy="3496016"/>
                     </a:xfrm>
                     <a:prstGeom prst="rect"/>
                   </pic:spPr>
@@ -1093,7 +1093,7 @@
       <w:r>
         <w:drawing>
           <wp:inline xmlns:a="http://schemas.openxmlformats.org/drawingml/2006/main" xmlns:pic="http://schemas.openxmlformats.org/drawingml/2006/picture">
-            <wp:extent cx="5989320" cy="3046615"/>
+            <wp:extent cx="5989320" cy="3496016"/>
             <wp:docPr id="11" name="Picture 11"/>
             <wp:cNvGraphicFramePr>
               <a:graphicFrameLocks noChangeAspect="1"/>
@@ -1114,7 +1114,7 @@
                   <pic:spPr>
                     <a:xfrm>
                       <a:off x="0" y="0"/>
-                      <a:ext cx="5989320" cy="3046615"/>
+                      <a:ext cx="5989320" cy="3496016"/>
                     </a:xfrm>
                     <a:prstGeom prst="rect"/>
                   </pic:spPr>
@@ -1191,7 +1191,7 @@
       <w:r>
         <w:drawing>
           <wp:inline xmlns:a="http://schemas.openxmlformats.org/drawingml/2006/main" xmlns:pic="http://schemas.openxmlformats.org/drawingml/2006/picture">
-            <wp:extent cx="5989320" cy="3046615"/>
+            <wp:extent cx="5989320" cy="3496016"/>
             <wp:docPr id="12" name="Picture 12"/>
             <wp:cNvGraphicFramePr>
               <a:graphicFrameLocks noChangeAspect="1"/>
@@ -1212,7 +1212,7 @@
                   <pic:spPr>
                     <a:xfrm>
                       <a:off x="0" y="0"/>
-                      <a:ext cx="5989320" cy="3046615"/>
+                      <a:ext cx="5989320" cy="3496016"/>
                     </a:xfrm>
                     <a:prstGeom prst="rect"/>
                   </pic:spPr>
@@ -1289,7 +1289,7 @@
       <w:r>
         <w:drawing>
           <wp:inline xmlns:a="http://schemas.openxmlformats.org/drawingml/2006/main" xmlns:pic="http://schemas.openxmlformats.org/drawingml/2006/picture">
-            <wp:extent cx="5989320" cy="3046615"/>
+            <wp:extent cx="5989320" cy="3496016"/>
             <wp:docPr id="13" name="Picture 13"/>
             <wp:cNvGraphicFramePr>
               <a:graphicFrameLocks noChangeAspect="1"/>
@@ -1310,7 +1310,7 @@
                   <pic:spPr>
                     <a:xfrm>
                       <a:off x="0" y="0"/>
-                      <a:ext cx="5989320" cy="3046615"/>
+                      <a:ext cx="5989320" cy="3496016"/>
                     </a:xfrm>
                     <a:prstGeom prst="rect"/>
                   </pic:spPr>
@@ -1387,7 +1387,7 @@
       <w:r>
         <w:drawing>
           <wp:inline xmlns:a="http://schemas.openxmlformats.org/drawingml/2006/main" xmlns:pic="http://schemas.openxmlformats.org/drawingml/2006/picture">
-            <wp:extent cx="5989320" cy="3046615"/>
+            <wp:extent cx="5989320" cy="3496016"/>
             <wp:docPr id="14" name="Picture 14"/>
             <wp:cNvGraphicFramePr>
               <a:graphicFrameLocks noChangeAspect="1"/>
@@ -1408,7 +1408,7 @@
                   <pic:spPr>
                     <a:xfrm>
                       <a:off x="0" y="0"/>
-                      <a:ext cx="5989320" cy="3046615"/>
+                      <a:ext cx="5989320" cy="3496016"/>
                     </a:xfrm>
                     <a:prstGeom prst="rect"/>
                   </pic:spPr>
@@ -1485,7 +1485,7 @@
       <w:r>
         <w:drawing>
           <wp:inline xmlns:a="http://schemas.openxmlformats.org/drawingml/2006/main" xmlns:pic="http://schemas.openxmlformats.org/drawingml/2006/picture">
-            <wp:extent cx="5989320" cy="3046615"/>
+            <wp:extent cx="5989320" cy="3496016"/>
             <wp:docPr id="15" name="Picture 15"/>
             <wp:cNvGraphicFramePr>
               <a:graphicFrameLocks noChangeAspect="1"/>
@@ -1506,7 +1506,7 @@
                   <pic:spPr>
                     <a:xfrm>
                       <a:off x="0" y="0"/>
-                      <a:ext cx="5989320" cy="3046615"/>
+                      <a:ext cx="5989320" cy="3496016"/>
                     </a:xfrm>
                     <a:prstGeom prst="rect"/>
                   </pic:spPr>
@@ -1583,7 +1583,7 @@
       <w:r>
         <w:drawing>
           <wp:inline xmlns:a="http://schemas.openxmlformats.org/drawingml/2006/main" xmlns:pic="http://schemas.openxmlformats.org/drawingml/2006/picture">
-            <wp:extent cx="5989320" cy="3046615"/>
+            <wp:extent cx="5989320" cy="3496016"/>
             <wp:docPr id="16" name="Picture 16"/>
             <wp:cNvGraphicFramePr>
               <a:graphicFrameLocks noChangeAspect="1"/>
@@ -1604,7 +1604,7 @@
                   <pic:spPr>
                     <a:xfrm>
                       <a:off x="0" y="0"/>
-                      <a:ext cx="5989320" cy="3046615"/>
+                      <a:ext cx="5989320" cy="3496016"/>
                     </a:xfrm>
                     <a:prstGeom prst="rect"/>
                   </pic:spPr>
@@ -1681,7 +1681,7 @@
       <w:r>
         <w:drawing>
           <wp:inline xmlns:a="http://schemas.openxmlformats.org/drawingml/2006/main" xmlns:pic="http://schemas.openxmlformats.org/drawingml/2006/picture">
-            <wp:extent cx="5989320" cy="3046615"/>
+            <wp:extent cx="5989320" cy="3496016"/>
             <wp:docPr id="17" name="Picture 17"/>
             <wp:cNvGraphicFramePr>
               <a:graphicFrameLocks noChangeAspect="1"/>
@@ -1702,7 +1702,7 @@
                   <pic:spPr>
                     <a:xfrm>
                       <a:off x="0" y="0"/>
-                      <a:ext cx="5989320" cy="3046615"/>
+                      <a:ext cx="5989320" cy="3496016"/>
                     </a:xfrm>
                     <a:prstGeom prst="rect"/>
                   </pic:spPr>
@@ -1779,7 +1779,7 @@
       <w:r>
         <w:drawing>
           <wp:inline xmlns:a="http://schemas.openxmlformats.org/drawingml/2006/main" xmlns:pic="http://schemas.openxmlformats.org/drawingml/2006/picture">
-            <wp:extent cx="5989320" cy="3046615"/>
+            <wp:extent cx="5989320" cy="3496016"/>
             <wp:docPr id="18" name="Picture 18"/>
             <wp:cNvGraphicFramePr>
               <a:graphicFrameLocks noChangeAspect="1"/>
@@ -1800,7 +1800,7 @@
                   <pic:spPr>
                     <a:xfrm>
                       <a:off x="0" y="0"/>
-                      <a:ext cx="5989320" cy="3046615"/>
+                      <a:ext cx="5989320" cy="3496016"/>
                     </a:xfrm>
                     <a:prstGeom prst="rect"/>
                   </pic:spPr>
@@ -1877,7 +1877,7 @@
       <w:r>
         <w:drawing>
           <wp:inline xmlns:a="http://schemas.openxmlformats.org/drawingml/2006/main" xmlns:pic="http://schemas.openxmlformats.org/drawingml/2006/picture">
-            <wp:extent cx="5989320" cy="3046615"/>
+            <wp:extent cx="5989320" cy="3496016"/>
             <wp:docPr id="19" name="Picture 19"/>
             <wp:cNvGraphicFramePr>
               <a:graphicFrameLocks noChangeAspect="1"/>
@@ -1898,7 +1898,7 @@
                   <pic:spPr>
                     <a:xfrm>
                       <a:off x="0" y="0"/>
-                      <a:ext cx="5989320" cy="3046615"/>
+                      <a:ext cx="5989320" cy="3496016"/>
                     </a:xfrm>
                     <a:prstGeom prst="rect"/>
                   </pic:spPr>
@@ -1975,7 +1975,7 @@
       <w:r>
         <w:drawing>
           <wp:inline xmlns:a="http://schemas.openxmlformats.org/drawingml/2006/main" xmlns:pic="http://schemas.openxmlformats.org/drawingml/2006/picture">
-            <wp:extent cx="5989320" cy="3046615"/>
+            <wp:extent cx="5989320" cy="3496016"/>
             <wp:docPr id="20" name="Picture 20"/>
             <wp:cNvGraphicFramePr>
               <a:graphicFrameLocks noChangeAspect="1"/>
@@ -1996,7 +1996,7 @@
                   <pic:spPr>
                     <a:xfrm>
                       <a:off x="0" y="0"/>
-                      <a:ext cx="5989320" cy="3046615"/>
+                      <a:ext cx="5989320" cy="3496016"/>
                     </a:xfrm>
                     <a:prstGeom prst="rect"/>
                   </pic:spPr>

</xml_diff>